<commit_message>
Fix three missing week-parity markers in the 2026 sem1 source docs
The overlap validator flagged three genuine conflicts, all one defect
class: a parity-only sub-row written without its marker. IA2603 Joi
13:15 Limba straina gets (par) (sub-row 2), IA2604 Joi 13:15 Limba
strainai gets (imp) (sub-row 1), I2502 Vineri 11:30 Baze de date(lab)
gets (imp). Weekly-load research (2.5 straina / 1.5 BD-lab sessions
per week across all comparator groups and last year's schedules) plus
the sub-row convention confirm the direction. Findings and the wayfinder
research from this session are recorded in docs/wayfinder/.

Generated-by: zcode/GLM-5.3-Flash
</commit_message>
<xml_diff>
--- a/src/Features/Integration/data/2026_sem1/zi/01.09.26/Orar_An_I Lic.docx
+++ b/src/Features/Integration/data/2026_sem1/zi/01.09.26/Orar_An_I Lic.docx
@@ -19199,7 +19199,7 @@
                 <w:szCs w:val="22"/>
                 <w:lang w:val="it-IT"/>
               </w:rPr>
-              <w:t>Limba straina</w:t>
+              <w:t>Limba straina(imp)</w:t>
             </w:r>
           </w:p>
           <w:p>
@@ -19584,7 +19584,7 @@
                 <w:szCs w:val="22"/>
                 <w:lang w:val="it-IT"/>
               </w:rPr>
-              <w:t>Limba straina</w:t>
+              <w:t>Limba straina(par)</w:t>
             </w:r>
           </w:p>
           <w:p>

</xml_diff>